<commit_message>
Math T8 — Unité 6 close : 11 scènes intégrées au docx
Co-authored-by: arena-agent <297053741+arena-agent@users.noreply.github.com>
</commit_message>
<xml_diff>
--- a/manuel-math-t8/Manuel_Mathematiques_T8_UNITE6.docx
+++ b/manuel-math-t8/Manuel_Mathematiques_T8_UNITE6.docx
@@ -2706,96 +2706,13 @@
     </w:p>
     <w:p>
       <w:pPr>
-        <w:spacing w:after="110" w:line="300"/>
-        <w:jc w:val="both"/>
-      </w:pPr>
-      <w:r>
-        <w:rPr>
-          <w:rFonts w:ascii="Times New Roman" w:cs="Times New Roman" w:eastAsia="Times New Roman" w:hAnsi="Times New Roman"/>
-          <w:b/>
-          <w:bCs/>
-          <w:i w:val="false"/>
-          <w:iCs w:val="false"/>
-          <w:color w:val="2E7D32"/>
-          <w:sz w:val="24"/>
-          <w:szCs w:val="24"/>
-        </w:rPr>
-        <w:t xml:space="preserve">Définition — </w:t>
-      </w:r>
-      <w:r>
-        <w:rPr>
-          <w:rFonts w:ascii="Times New Roman" w:cs="Times New Roman" w:eastAsia="Times New Roman" w:hAnsi="Times New Roman"/>
-          <w:b/>
-          <w:bCs/>
-          <w:i w:val="false"/>
-          <w:iCs w:val="false"/>
-          <w:color w:val="000000"/>
-          <w:sz w:val="24"/>
-          <w:szCs w:val="24"/>
-        </w:rPr>
-        <w:t xml:space="preserve">En statistique, la population est l’ensemble étudié ; un individu est un élément de cette population ; le caractère est la propriété que l’on étudie sur chaque individu. Un caractère est qualitatif s’il s’exprime par des mots, quantitatif s’il s’exprime par des nombres.</w:t>
-      </w:r>
-    </w:p>
-    <w:p>
-      <w:pPr>
-        <w:spacing w:after="110" w:line="300"/>
-        <w:jc w:val="both"/>
-      </w:pPr>
-      <w:r>
-        <w:rPr>
-          <w:rFonts w:ascii="Times New Roman" w:cs="Times New Roman" w:eastAsia="Times New Roman" w:hAnsi="Times New Roman"/>
-          <w:b/>
-          <w:bCs/>
-          <w:i w:val="false"/>
-          <w:iCs w:val="false"/>
-          <w:color w:val="1F4E79"/>
-          <w:sz w:val="24"/>
-          <w:szCs w:val="24"/>
-        </w:rPr>
-        <w:t xml:space="preserve">Autrement dit : </w:t>
-      </w:r>
-      <w:r>
-        <w:rPr>
-          <w:rFonts w:ascii="Times New Roman" w:cs="Times New Roman" w:eastAsia="Times New Roman" w:hAnsi="Times New Roman"/>
-          <w:b w:val="false"/>
-          <w:bCs w:val="false"/>
-          <w:i w:val="false"/>
-          <w:iCs w:val="false"/>
-          <w:color w:val="000000"/>
-          <w:sz w:val="24"/>
-          <w:szCs w:val="24"/>
-        </w:rPr>
-        <w:t xml:space="preserve">population = le groupe entier ; individu = un membre du groupe ; caractère = la question posée à chacun.</w:t>
-      </w:r>
-    </w:p>
-    <w:p>
-      <w:pPr>
-        <w:spacing w:after="110" w:line="300"/>
-        <w:jc w:val="both"/>
-      </w:pPr>
-      <w:r>
-        <w:rPr>
-          <w:rFonts w:ascii="Times New Roman" w:cs="Times New Roman" w:eastAsia="Times New Roman" w:hAnsi="Times New Roman"/>
-          <w:b w:val="false"/>
-          <w:bCs w:val="false"/>
-          <w:i w:val="false"/>
-          <w:iCs w:val="false"/>
-          <w:color w:val="000000"/>
-          <w:sz w:val="24"/>
-          <w:szCs w:val="24"/>
-        </w:rPr>
-        <w:t xml:space="preserve">Malgré son nom, la population statistique n’est pas forcément humaine : l’ensemble des ampoules d’une usine, des zébus d’un marché ou des jours du mois peuvent former une population — un « individu » est alors une ampoule, un zébu, un jour ! Le caractère se classe en deux familles : qualitatif (couleur préférée, moyen de transport — des mots) et quantitatif (taille, nombre de frères et sœurs — des nombres). Cette distinction commande toute la suite : les diagrammes et les calculs possibles dépendent de la nature du caractère — on ne calcule pas la « moyenne des couleurs » !</w:t>
-      </w:r>
-    </w:p>
-    <w:p>
-      <w:pPr>
         <w:spacing w:after="120" w:before="120"/>
         <w:jc w:val="center"/>
       </w:pPr>
       <w:r>
         <w:drawing>
           <wp:inline distT="0" distB="0" distL="0" distR="0">
-            <wp:extent cx="4762500" cy="2305050"/>
+            <wp:extent cx="4095750" cy="2238375"/>
             <wp:effectExtent t="0" r="0" b="0" l="0"/>
             <wp:docPr id="1" name="" descr="" title=""/>
             <wp:cNvGraphicFramePr>
@@ -2812,6 +2729,135 @@
                   </pic:nvPicPr>
                   <pic:blipFill>
                     <a:blip r:embed="rId9" cstate="none"/>
+                    <a:srcRect/>
+                    <a:stretch>
+                      <a:fillRect/>
+                    </a:stretch>
+                  </pic:blipFill>
+                  <pic:spPr bwMode="auto">
+                    <a:xfrm>
+                      <a:off x="0" y="0"/>
+                      <a:ext cx="4095750" cy="2238375"/>
+                    </a:xfrm>
+                    <a:prstGeom prst="rect">
+                      <a:avLst/>
+                    </a:prstGeom>
+                  </pic:spPr>
+                </pic:pic>
+              </a:graphicData>
+            </a:graphic>
+          </wp:inline>
+        </w:drawing>
+      </w:r>
+    </w:p>
+    <w:p>
+      <w:pPr>
+        <w:spacing w:after="110" w:line="300"/>
+        <w:jc w:val="both"/>
+      </w:pPr>
+      <w:r>
+        <w:rPr>
+          <w:rFonts w:ascii="Times New Roman" w:cs="Times New Roman" w:eastAsia="Times New Roman" w:hAnsi="Times New Roman"/>
+          <w:b/>
+          <w:bCs/>
+          <w:i w:val="false"/>
+          <w:iCs w:val="false"/>
+          <w:color w:val="2E7D32"/>
+          <w:sz w:val="24"/>
+          <w:szCs w:val="24"/>
+        </w:rPr>
+        <w:t xml:space="preserve">Définition — </w:t>
+      </w:r>
+      <w:r>
+        <w:rPr>
+          <w:rFonts w:ascii="Times New Roman" w:cs="Times New Roman" w:eastAsia="Times New Roman" w:hAnsi="Times New Roman"/>
+          <w:b/>
+          <w:bCs/>
+          <w:i w:val="false"/>
+          <w:iCs w:val="false"/>
+          <w:color w:val="000000"/>
+          <w:sz w:val="24"/>
+          <w:szCs w:val="24"/>
+        </w:rPr>
+        <w:t xml:space="preserve">En statistique, la population est l’ensemble étudié ; un individu est un élément de cette population ; le caractère est la propriété que l’on étudie sur chaque individu. Un caractère est qualitatif s’il s’exprime par des mots, quantitatif s’il s’exprime par des nombres.</w:t>
+      </w:r>
+    </w:p>
+    <w:p>
+      <w:pPr>
+        <w:spacing w:after="110" w:line="300"/>
+        <w:jc w:val="both"/>
+      </w:pPr>
+      <w:r>
+        <w:rPr>
+          <w:rFonts w:ascii="Times New Roman" w:cs="Times New Roman" w:eastAsia="Times New Roman" w:hAnsi="Times New Roman"/>
+          <w:b/>
+          <w:bCs/>
+          <w:i w:val="false"/>
+          <w:iCs w:val="false"/>
+          <w:color w:val="1F4E79"/>
+          <w:sz w:val="24"/>
+          <w:szCs w:val="24"/>
+        </w:rPr>
+        <w:t xml:space="preserve">Autrement dit : </w:t>
+      </w:r>
+      <w:r>
+        <w:rPr>
+          <w:rFonts w:ascii="Times New Roman" w:cs="Times New Roman" w:eastAsia="Times New Roman" w:hAnsi="Times New Roman"/>
+          <w:b w:val="false"/>
+          <w:bCs w:val="false"/>
+          <w:i w:val="false"/>
+          <w:iCs w:val="false"/>
+          <w:color w:val="000000"/>
+          <w:sz w:val="24"/>
+          <w:szCs w:val="24"/>
+        </w:rPr>
+        <w:t xml:space="preserve">population = le groupe entier ; individu = un membre du groupe ; caractère = la question posée à chacun.</w:t>
+      </w:r>
+    </w:p>
+    <w:p>
+      <w:pPr>
+        <w:spacing w:after="110" w:line="300"/>
+        <w:jc w:val="both"/>
+      </w:pPr>
+      <w:r>
+        <w:rPr>
+          <w:rFonts w:ascii="Times New Roman" w:cs="Times New Roman" w:eastAsia="Times New Roman" w:hAnsi="Times New Roman"/>
+          <w:b w:val="false"/>
+          <w:bCs w:val="false"/>
+          <w:i w:val="false"/>
+          <w:iCs w:val="false"/>
+          <w:color w:val="000000"/>
+          <w:sz w:val="24"/>
+          <w:szCs w:val="24"/>
+        </w:rPr>
+        <w:t xml:space="preserve">Malgré son nom, la population statistique n’est pas forcément humaine : l’ensemble des ampoules d’une usine, des zébus d’un marché ou des jours du mois peuvent former une population — un « individu » est alors une ampoule, un zébu, un jour ! Le caractère se classe en deux familles : qualitatif (couleur préférée, moyen de transport — des mots) et quantitatif (taille, nombre de frères et sœurs — des nombres). Cette distinction commande toute la suite : les diagrammes et les calculs possibles dépendent de la nature du caractère — on ne calcule pas la « moyenne des couleurs » !</w:t>
+      </w:r>
+    </w:p>
+    <w:p>
+      <w:pPr>
+        <w:spacing w:after="120" w:before="120"/>
+        <w:jc w:val="center"/>
+      </w:pPr>
+      <w:r>
+        <w:drawing>
+          <wp:inline distT="0" distB="0" distL="0" distR="0">
+            <wp:extent cx="4762500" cy="2305050"/>
+            <wp:effectExtent t="0" r="0" b="0" l="0"/>
+            <wp:docPr id="2" name="" descr="" title=""/>
+            <wp:cNvGraphicFramePr>
+              <a:graphicFrameLocks xmlns:a="http://schemas.openxmlformats.org/drawingml/2006/main" noChangeAspect="1"/>
+            </wp:cNvGraphicFramePr>
+            <a:graphic xmlns:a="http://schemas.openxmlformats.org/drawingml/2006/main">
+              <a:graphicData uri="http://schemas.openxmlformats.org/drawingml/2006/picture">
+                <pic:pic xmlns:pic="http://schemas.openxmlformats.org/drawingml/2006/picture">
+                  <pic:nvPicPr>
+                    <pic:cNvPr id="0" name="" descr=""/>
+                    <pic:cNvPicPr>
+                      <a:picLocks noChangeAspect="1" noChangeArrowheads="1"/>
+                    </pic:cNvPicPr>
+                  </pic:nvPicPr>
+                  <pic:blipFill>
+                    <a:blip r:embed="rId10" cstate="none"/>
                     <a:srcRect/>
                     <a:stretch>
                       <a:fillRect/>
@@ -5555,98 +5601,15 @@
     </w:p>
     <w:p>
       <w:pPr>
-        <w:spacing w:after="110" w:line="300"/>
-        <w:jc w:val="both"/>
-      </w:pPr>
-      <w:r>
-        <w:rPr>
-          <w:rFonts w:ascii="Times New Roman" w:cs="Times New Roman" w:eastAsia="Times New Roman" w:hAnsi="Times New Roman"/>
-          <w:b/>
-          <w:bCs/>
-          <w:i w:val="false"/>
-          <w:iCs w:val="false"/>
-          <w:color w:val="2E7D32"/>
-          <w:sz w:val="24"/>
-          <w:szCs w:val="24"/>
-        </w:rPr>
-        <w:t xml:space="preserve">Définition — </w:t>
-      </w:r>
-      <w:r>
-        <w:rPr>
-          <w:rFonts w:ascii="Times New Roman" w:cs="Times New Roman" w:eastAsia="Times New Roman" w:hAnsi="Times New Roman"/>
-          <w:b/>
-          <w:bCs/>
-          <w:i w:val="false"/>
-          <w:iCs w:val="false"/>
-          <w:color w:val="000000"/>
-          <w:sz w:val="24"/>
-          <w:szCs w:val="24"/>
-        </w:rPr>
-        <w:t xml:space="preserve">Les modalités d’un caractère sont les différentes valeurs ou réponses qu’il peut prendre. L’effectif d’une modalité est le nombre d’individus qui présentent cette modalité ; la somme des effectifs de toutes les modalités est l’effectif total de la population.</w:t>
-      </w:r>
-    </w:p>
-    <w:p>
-      <w:pPr>
-        <w:spacing w:after="110" w:line="300"/>
-        <w:jc w:val="both"/>
-      </w:pPr>
-      <w:r>
-        <w:rPr>
-          <w:rFonts w:ascii="Times New Roman" w:cs="Times New Roman" w:eastAsia="Times New Roman" w:hAnsi="Times New Roman"/>
-          <w:b/>
-          <w:bCs/>
-          <w:i w:val="false"/>
-          <w:iCs w:val="false"/>
-          <w:color w:val="1F4E79"/>
-          <w:sz w:val="24"/>
-          <w:szCs w:val="24"/>
-        </w:rPr>
-        <w:t xml:space="preserve">Autrement dit : </w:t>
-      </w:r>
-      <w:r>
-        <w:rPr>
-          <w:rFonts w:ascii="Times New Roman" w:cs="Times New Roman" w:eastAsia="Times New Roman" w:hAnsi="Times New Roman"/>
-          <w:b w:val="false"/>
-          <w:bCs w:val="false"/>
-          <w:i w:val="false"/>
-          <w:iCs w:val="false"/>
-          <w:color w:val="000000"/>
-          <w:sz w:val="24"/>
-          <w:szCs w:val="24"/>
-        </w:rPr>
-        <w:t xml:space="preserve">modalités = les cases du tri ; effectif = le nombre de papiers dans chaque case.</w:t>
-      </w:r>
-    </w:p>
-    <w:p>
-      <w:pPr>
-        <w:spacing w:after="110" w:line="300"/>
-        <w:jc w:val="both"/>
-      </w:pPr>
-      <w:r>
-        <w:rPr>
-          <w:rFonts w:ascii="Times New Roman" w:cs="Times New Roman" w:eastAsia="Times New Roman" w:hAnsi="Times New Roman"/>
-          <w:b w:val="false"/>
-          <w:bCs w:val="false"/>
-          <w:i w:val="false"/>
-          <w:iCs w:val="false"/>
-          <w:color w:val="000000"/>
-          <w:sz w:val="24"/>
-          <w:szCs w:val="24"/>
-        </w:rPr>
-        <w:t xml:space="preserve">Le dépouillement se fait au tableau de comptage : une ligne par modalité, un bâton par réponse, par paquets de cinq pour compter vite (IIII barré). Le contrôle de fin est obligatoire : la somme des effectifs doit redonner l’effectif total — 8 + 12 + 6 + 4 = 30 papiers, personne n’est perdu ni compté deux fois. Pour un caractère quantitatif, les modalités sont des nombres (0, 1, 2, 3 frères et sœurs…) et se rangent en ordre croissant. L’effectif le plus grand désigne la modalité dominante — le futur « gagnant » de l’enquête.</w:t>
-      </w:r>
-    </w:p>
-    <w:p>
-      <w:pPr>
         <w:spacing w:after="120" w:before="120"/>
         <w:jc w:val="center"/>
       </w:pPr>
       <w:r>
         <w:drawing>
           <wp:inline distT="0" distB="0" distL="0" distR="0">
-            <wp:extent cx="4762500" cy="1809750"/>
+            <wp:extent cx="4095750" cy="2238375"/>
             <wp:effectExtent t="0" r="0" b="0" l="0"/>
-            <wp:docPr id="2" name="" descr="" title=""/>
+            <wp:docPr id="3" name="" descr="" title=""/>
             <wp:cNvGraphicFramePr>
               <a:graphicFrameLocks xmlns:a="http://schemas.openxmlformats.org/drawingml/2006/main" noChangeAspect="1"/>
             </wp:cNvGraphicFramePr>
@@ -5660,7 +5623,136 @@
                     </pic:cNvPicPr>
                   </pic:nvPicPr>
                   <pic:blipFill>
-                    <a:blip r:embed="rId10" cstate="none"/>
+                    <a:blip r:embed="rId11" cstate="none"/>
+                    <a:srcRect/>
+                    <a:stretch>
+                      <a:fillRect/>
+                    </a:stretch>
+                  </pic:blipFill>
+                  <pic:spPr bwMode="auto">
+                    <a:xfrm>
+                      <a:off x="0" y="0"/>
+                      <a:ext cx="4095750" cy="2238375"/>
+                    </a:xfrm>
+                    <a:prstGeom prst="rect">
+                      <a:avLst/>
+                    </a:prstGeom>
+                  </pic:spPr>
+                </pic:pic>
+              </a:graphicData>
+            </a:graphic>
+          </wp:inline>
+        </w:drawing>
+      </w:r>
+    </w:p>
+    <w:p>
+      <w:pPr>
+        <w:spacing w:after="110" w:line="300"/>
+        <w:jc w:val="both"/>
+      </w:pPr>
+      <w:r>
+        <w:rPr>
+          <w:rFonts w:ascii="Times New Roman" w:cs="Times New Roman" w:eastAsia="Times New Roman" w:hAnsi="Times New Roman"/>
+          <w:b/>
+          <w:bCs/>
+          <w:i w:val="false"/>
+          <w:iCs w:val="false"/>
+          <w:color w:val="2E7D32"/>
+          <w:sz w:val="24"/>
+          <w:szCs w:val="24"/>
+        </w:rPr>
+        <w:t xml:space="preserve">Définition — </w:t>
+      </w:r>
+      <w:r>
+        <w:rPr>
+          <w:rFonts w:ascii="Times New Roman" w:cs="Times New Roman" w:eastAsia="Times New Roman" w:hAnsi="Times New Roman"/>
+          <w:b/>
+          <w:bCs/>
+          <w:i w:val="false"/>
+          <w:iCs w:val="false"/>
+          <w:color w:val="000000"/>
+          <w:sz w:val="24"/>
+          <w:szCs w:val="24"/>
+        </w:rPr>
+        <w:t xml:space="preserve">Les modalités d’un caractère sont les différentes valeurs ou réponses qu’il peut prendre. L’effectif d’une modalité est le nombre d’individus qui présentent cette modalité ; la somme des effectifs de toutes les modalités est l’effectif total de la population.</w:t>
+      </w:r>
+    </w:p>
+    <w:p>
+      <w:pPr>
+        <w:spacing w:after="110" w:line="300"/>
+        <w:jc w:val="both"/>
+      </w:pPr>
+      <w:r>
+        <w:rPr>
+          <w:rFonts w:ascii="Times New Roman" w:cs="Times New Roman" w:eastAsia="Times New Roman" w:hAnsi="Times New Roman"/>
+          <w:b/>
+          <w:bCs/>
+          <w:i w:val="false"/>
+          <w:iCs w:val="false"/>
+          <w:color w:val="1F4E79"/>
+          <w:sz w:val="24"/>
+          <w:szCs w:val="24"/>
+        </w:rPr>
+        <w:t xml:space="preserve">Autrement dit : </w:t>
+      </w:r>
+      <w:r>
+        <w:rPr>
+          <w:rFonts w:ascii="Times New Roman" w:cs="Times New Roman" w:eastAsia="Times New Roman" w:hAnsi="Times New Roman"/>
+          <w:b w:val="false"/>
+          <w:bCs w:val="false"/>
+          <w:i w:val="false"/>
+          <w:iCs w:val="false"/>
+          <w:color w:val="000000"/>
+          <w:sz w:val="24"/>
+          <w:szCs w:val="24"/>
+        </w:rPr>
+        <w:t xml:space="preserve">modalités = les cases du tri ; effectif = le nombre de papiers dans chaque case.</w:t>
+      </w:r>
+    </w:p>
+    <w:p>
+      <w:pPr>
+        <w:spacing w:after="110" w:line="300"/>
+        <w:jc w:val="both"/>
+      </w:pPr>
+      <w:r>
+        <w:rPr>
+          <w:rFonts w:ascii="Times New Roman" w:cs="Times New Roman" w:eastAsia="Times New Roman" w:hAnsi="Times New Roman"/>
+          <w:b w:val="false"/>
+          <w:bCs w:val="false"/>
+          <w:i w:val="false"/>
+          <w:iCs w:val="false"/>
+          <w:color w:val="000000"/>
+          <w:sz w:val="24"/>
+          <w:szCs w:val="24"/>
+        </w:rPr>
+        <w:t xml:space="preserve">Le dépouillement se fait au tableau de comptage : une ligne par modalité, un bâton par réponse, par paquets de cinq pour compter vite (IIII barré). Le contrôle de fin est obligatoire : la somme des effectifs doit redonner l’effectif total — 8 + 12 + 6 + 4 = 30 papiers, personne n’est perdu ni compté deux fois. Pour un caractère quantitatif, les modalités sont des nombres (0, 1, 2, 3 frères et sœurs…) et se rangent en ordre croissant. L’effectif le plus grand désigne la modalité dominante — le futur « gagnant » de l’enquête.</w:t>
+      </w:r>
+    </w:p>
+    <w:p>
+      <w:pPr>
+        <w:spacing w:after="120" w:before="120"/>
+        <w:jc w:val="center"/>
+      </w:pPr>
+      <w:r>
+        <w:drawing>
+          <wp:inline distT="0" distB="0" distL="0" distR="0">
+            <wp:extent cx="4762500" cy="1809750"/>
+            <wp:effectExtent t="0" r="0" b="0" l="0"/>
+            <wp:docPr id="4" name="" descr="" title=""/>
+            <wp:cNvGraphicFramePr>
+              <a:graphicFrameLocks xmlns:a="http://schemas.openxmlformats.org/drawingml/2006/main" noChangeAspect="1"/>
+            </wp:cNvGraphicFramePr>
+            <a:graphic xmlns:a="http://schemas.openxmlformats.org/drawingml/2006/main">
+              <a:graphicData uri="http://schemas.openxmlformats.org/drawingml/2006/picture">
+                <pic:pic xmlns:pic="http://schemas.openxmlformats.org/drawingml/2006/picture">
+                  <pic:nvPicPr>
+                    <pic:cNvPr id="0" name="" descr=""/>
+                    <pic:cNvPicPr>
+                      <a:picLocks noChangeAspect="1" noChangeArrowheads="1"/>
+                    </pic:cNvPicPr>
+                  </pic:nvPicPr>
+                  <pic:blipFill>
+                    <a:blip r:embed="rId12" cstate="none"/>
                     <a:srcRect/>
                     <a:stretch>
                       <a:fillRect/>
@@ -8404,98 +8496,15 @@
     </w:p>
     <w:p>
       <w:pPr>
-        <w:spacing w:after="110" w:line="300"/>
-        <w:jc w:val="both"/>
-      </w:pPr>
-      <w:r>
-        <w:rPr>
-          <w:rFonts w:ascii="Times New Roman" w:cs="Times New Roman" w:eastAsia="Times New Roman" w:hAnsi="Times New Roman"/>
-          <w:b/>
-          <w:bCs/>
-          <w:i w:val="false"/>
-          <w:iCs w:val="false"/>
-          <w:color w:val="2E7D32"/>
-          <w:sz w:val="24"/>
-          <w:szCs w:val="24"/>
-        </w:rPr>
-        <w:t xml:space="preserve">Définition — </w:t>
-      </w:r>
-      <w:r>
-        <w:rPr>
-          <w:rFonts w:ascii="Times New Roman" w:cs="Times New Roman" w:eastAsia="Times New Roman" w:hAnsi="Times New Roman"/>
-          <w:b/>
-          <w:bCs/>
-          <w:i w:val="false"/>
-          <w:iCs w:val="false"/>
-          <w:color w:val="000000"/>
-          <w:sz w:val="24"/>
-          <w:szCs w:val="24"/>
-        </w:rPr>
-        <w:t xml:space="preserve">Un tableau statistique présente en lignes ou en colonnes les modalités du caractère, leurs effectifs (et souvent leurs fréquences), avec une ligne TOTAL qui récapitule l’effectif total. Il est la forme ordonnée et vérifiable des données brutes.</w:t>
-      </w:r>
-    </w:p>
-    <w:p>
-      <w:pPr>
-        <w:spacing w:after="110" w:line="300"/>
-        <w:jc w:val="both"/>
-      </w:pPr>
-      <w:r>
-        <w:rPr>
-          <w:rFonts w:ascii="Times New Roman" w:cs="Times New Roman" w:eastAsia="Times New Roman" w:hAnsi="Times New Roman"/>
-          <w:b/>
-          <w:bCs/>
-          <w:i w:val="false"/>
-          <w:iCs w:val="false"/>
-          <w:color w:val="1F4E79"/>
-          <w:sz w:val="24"/>
-          <w:szCs w:val="24"/>
-        </w:rPr>
-        <w:t xml:space="preserve">Autrement dit : </w:t>
-      </w:r>
-      <w:r>
-        <w:rPr>
-          <w:rFonts w:ascii="Times New Roman" w:cs="Times New Roman" w:eastAsia="Times New Roman" w:hAnsi="Times New Roman"/>
-          <w:b w:val="false"/>
-          <w:bCs w:val="false"/>
-          <w:i w:val="false"/>
-          <w:iCs w:val="false"/>
-          <w:color w:val="000000"/>
-          <w:sz w:val="24"/>
-          <w:szCs w:val="24"/>
-        </w:rPr>
-        <w:t xml:space="preserve">le tableau est la carte d’identité de l’enquête : chaque modalité a sa ligne, et le total signe le document.</w:t>
-      </w:r>
-    </w:p>
-    <w:p>
-      <w:pPr>
-        <w:spacing w:after="110" w:line="300"/>
-        <w:jc w:val="both"/>
-      </w:pPr>
-      <w:r>
-        <w:rPr>
-          <w:rFonts w:ascii="Times New Roman" w:cs="Times New Roman" w:eastAsia="Times New Roman" w:hAnsi="Times New Roman"/>
-          <w:b w:val="false"/>
-          <w:bCs w:val="false"/>
-          <w:i w:val="false"/>
-          <w:iCs w:val="false"/>
-          <w:color w:val="000000"/>
-          <w:sz w:val="24"/>
-          <w:szCs w:val="24"/>
-        </w:rPr>
-        <w:t xml:space="preserve">Les règles de l’art : un TITRE (qui, quoi, quand — « Transport des élèves de 8ᵉ, mars 2026 »), des colonnes nommées (modalité, effectif, fréquence), les modalités rangées (ordre croissant si nombres, du plus fréquent au moins fréquent si mots), et la ligne TOTAL qui verrouille. Le tableau prépare tous les traitements à venir : fréquences (effectif ÷ total), diagrammes (hauteurs ou angles), moyenne. Un tableau sans total est un tableau invérifiable ; un tableau sans titre est un tableau muet — les deux fautes coûtent cher dans une vraie publication.</w:t>
-      </w:r>
-    </w:p>
-    <w:p>
-      <w:pPr>
         <w:spacing w:after="120" w:before="120"/>
         <w:jc w:val="center"/>
       </w:pPr>
       <w:r>
         <w:drawing>
           <wp:inline distT="0" distB="0" distL="0" distR="0">
-            <wp:extent cx="4762500" cy="2266950"/>
+            <wp:extent cx="4095750" cy="2238375"/>
             <wp:effectExtent t="0" r="0" b="0" l="0"/>
-            <wp:docPr id="3" name="" descr="" title=""/>
+            <wp:docPr id="5" name="" descr="" title=""/>
             <wp:cNvGraphicFramePr>
               <a:graphicFrameLocks xmlns:a="http://schemas.openxmlformats.org/drawingml/2006/main" noChangeAspect="1"/>
             </wp:cNvGraphicFramePr>
@@ -8509,7 +8518,136 @@
                     </pic:cNvPicPr>
                   </pic:nvPicPr>
                   <pic:blipFill>
-                    <a:blip r:embed="rId11" cstate="none"/>
+                    <a:blip r:embed="rId13" cstate="none"/>
+                    <a:srcRect/>
+                    <a:stretch>
+                      <a:fillRect/>
+                    </a:stretch>
+                  </pic:blipFill>
+                  <pic:spPr bwMode="auto">
+                    <a:xfrm>
+                      <a:off x="0" y="0"/>
+                      <a:ext cx="4095750" cy="2238375"/>
+                    </a:xfrm>
+                    <a:prstGeom prst="rect">
+                      <a:avLst/>
+                    </a:prstGeom>
+                  </pic:spPr>
+                </pic:pic>
+              </a:graphicData>
+            </a:graphic>
+          </wp:inline>
+        </w:drawing>
+      </w:r>
+    </w:p>
+    <w:p>
+      <w:pPr>
+        <w:spacing w:after="110" w:line="300"/>
+        <w:jc w:val="both"/>
+      </w:pPr>
+      <w:r>
+        <w:rPr>
+          <w:rFonts w:ascii="Times New Roman" w:cs="Times New Roman" w:eastAsia="Times New Roman" w:hAnsi="Times New Roman"/>
+          <w:b/>
+          <w:bCs/>
+          <w:i w:val="false"/>
+          <w:iCs w:val="false"/>
+          <w:color w:val="2E7D32"/>
+          <w:sz w:val="24"/>
+          <w:szCs w:val="24"/>
+        </w:rPr>
+        <w:t xml:space="preserve">Définition — </w:t>
+      </w:r>
+      <w:r>
+        <w:rPr>
+          <w:rFonts w:ascii="Times New Roman" w:cs="Times New Roman" w:eastAsia="Times New Roman" w:hAnsi="Times New Roman"/>
+          <w:b/>
+          <w:bCs/>
+          <w:i w:val="false"/>
+          <w:iCs w:val="false"/>
+          <w:color w:val="000000"/>
+          <w:sz w:val="24"/>
+          <w:szCs w:val="24"/>
+        </w:rPr>
+        <w:t xml:space="preserve">Un tableau statistique présente en lignes ou en colonnes les modalités du caractère, leurs effectifs (et souvent leurs fréquences), avec une ligne TOTAL qui récapitule l’effectif total. Il est la forme ordonnée et vérifiable des données brutes.</w:t>
+      </w:r>
+    </w:p>
+    <w:p>
+      <w:pPr>
+        <w:spacing w:after="110" w:line="300"/>
+        <w:jc w:val="both"/>
+      </w:pPr>
+      <w:r>
+        <w:rPr>
+          <w:rFonts w:ascii="Times New Roman" w:cs="Times New Roman" w:eastAsia="Times New Roman" w:hAnsi="Times New Roman"/>
+          <w:b/>
+          <w:bCs/>
+          <w:i w:val="false"/>
+          <w:iCs w:val="false"/>
+          <w:color w:val="1F4E79"/>
+          <w:sz w:val="24"/>
+          <w:szCs w:val="24"/>
+        </w:rPr>
+        <w:t xml:space="preserve">Autrement dit : </w:t>
+      </w:r>
+      <w:r>
+        <w:rPr>
+          <w:rFonts w:ascii="Times New Roman" w:cs="Times New Roman" w:eastAsia="Times New Roman" w:hAnsi="Times New Roman"/>
+          <w:b w:val="false"/>
+          <w:bCs w:val="false"/>
+          <w:i w:val="false"/>
+          <w:iCs w:val="false"/>
+          <w:color w:val="000000"/>
+          <w:sz w:val="24"/>
+          <w:szCs w:val="24"/>
+        </w:rPr>
+        <w:t xml:space="preserve">le tableau est la carte d’identité de l’enquête : chaque modalité a sa ligne, et le total signe le document.</w:t>
+      </w:r>
+    </w:p>
+    <w:p>
+      <w:pPr>
+        <w:spacing w:after="110" w:line="300"/>
+        <w:jc w:val="both"/>
+      </w:pPr>
+      <w:r>
+        <w:rPr>
+          <w:rFonts w:ascii="Times New Roman" w:cs="Times New Roman" w:eastAsia="Times New Roman" w:hAnsi="Times New Roman"/>
+          <w:b w:val="false"/>
+          <w:bCs w:val="false"/>
+          <w:i w:val="false"/>
+          <w:iCs w:val="false"/>
+          <w:color w:val="000000"/>
+          <w:sz w:val="24"/>
+          <w:szCs w:val="24"/>
+        </w:rPr>
+        <w:t xml:space="preserve">Les règles de l’art : un TITRE (qui, quoi, quand — « Transport des élèves de 8ᵉ, mars 2026 »), des colonnes nommées (modalité, effectif, fréquence), les modalités rangées (ordre croissant si nombres, du plus fréquent au moins fréquent si mots), et la ligne TOTAL qui verrouille. Le tableau prépare tous les traitements à venir : fréquences (effectif ÷ total), diagrammes (hauteurs ou angles), moyenne. Un tableau sans total est un tableau invérifiable ; un tableau sans titre est un tableau muet — les deux fautes coûtent cher dans une vraie publication.</w:t>
+      </w:r>
+    </w:p>
+    <w:p>
+      <w:pPr>
+        <w:spacing w:after="120" w:before="120"/>
+        <w:jc w:val="center"/>
+      </w:pPr>
+      <w:r>
+        <w:drawing>
+          <wp:inline distT="0" distB="0" distL="0" distR="0">
+            <wp:extent cx="4762500" cy="2266950"/>
+            <wp:effectExtent t="0" r="0" b="0" l="0"/>
+            <wp:docPr id="6" name="" descr="" title=""/>
+            <wp:cNvGraphicFramePr>
+              <a:graphicFrameLocks xmlns:a="http://schemas.openxmlformats.org/drawingml/2006/main" noChangeAspect="1"/>
+            </wp:cNvGraphicFramePr>
+            <a:graphic xmlns:a="http://schemas.openxmlformats.org/drawingml/2006/main">
+              <a:graphicData uri="http://schemas.openxmlformats.org/drawingml/2006/picture">
+                <pic:pic xmlns:pic="http://schemas.openxmlformats.org/drawingml/2006/picture">
+                  <pic:nvPicPr>
+                    <pic:cNvPr id="0" name="" descr=""/>
+                    <pic:cNvPicPr>
+                      <a:picLocks noChangeAspect="1" noChangeArrowheads="1"/>
+                    </pic:cNvPicPr>
+                  </pic:nvPicPr>
+                  <pic:blipFill>
+                    <a:blip r:embed="rId14" cstate="none"/>
                     <a:srcRect/>
                     <a:stretch>
                       <a:fillRect/>
@@ -11253,98 +11391,15 @@
     </w:p>
     <w:p>
       <w:pPr>
-        <w:spacing w:after="110" w:line="300"/>
-        <w:jc w:val="both"/>
-      </w:pPr>
-      <w:r>
-        <w:rPr>
-          <w:rFonts w:ascii="Times New Roman" w:cs="Times New Roman" w:eastAsia="Times New Roman" w:hAnsi="Times New Roman"/>
-          <w:b/>
-          <w:bCs/>
-          <w:i w:val="false"/>
-          <w:iCs w:val="false"/>
-          <w:color w:val="2E7D32"/>
-          <w:sz w:val="24"/>
-          <w:szCs w:val="24"/>
-        </w:rPr>
-        <w:t xml:space="preserve">Définition — </w:t>
-      </w:r>
-      <w:r>
-        <w:rPr>
-          <w:rFonts w:ascii="Times New Roman" w:cs="Times New Roman" w:eastAsia="Times New Roman" w:hAnsi="Times New Roman"/>
-          <w:b/>
-          <w:bCs/>
-          <w:i w:val="false"/>
-          <w:iCs w:val="false"/>
-          <w:color w:val="000000"/>
-          <w:sz w:val="24"/>
-          <w:szCs w:val="24"/>
-        </w:rPr>
-        <w:t xml:space="preserve">Un diagramme en bâtons représente chaque modalité par un bâton (ou une barre) dont la hauteur est proportionnelle à l’effectif, mesurée sur un axe gradué régulièrement. Les bâtons, de même largeur, sont séparés les uns des autres.</w:t>
-      </w:r>
-    </w:p>
-    <w:p>
-      <w:pPr>
-        <w:spacing w:after="110" w:line="300"/>
-        <w:jc w:val="both"/>
-      </w:pPr>
-      <w:r>
-        <w:rPr>
-          <w:rFonts w:ascii="Times New Roman" w:cs="Times New Roman" w:eastAsia="Times New Roman" w:hAnsi="Times New Roman"/>
-          <w:b/>
-          <w:bCs/>
-          <w:i w:val="false"/>
-          <w:iCs w:val="false"/>
-          <w:color w:val="1F4E79"/>
-          <w:sz w:val="24"/>
-          <w:szCs w:val="24"/>
-        </w:rPr>
-        <w:t xml:space="preserve">Autrement dit : </w:t>
-      </w:r>
-      <w:r>
-        <w:rPr>
-          <w:rFonts w:ascii="Times New Roman" w:cs="Times New Roman" w:eastAsia="Times New Roman" w:hAnsi="Times New Roman"/>
-          <w:b w:val="false"/>
-          <w:bCs w:val="false"/>
-          <w:i w:val="false"/>
-          <w:iCs w:val="false"/>
-          <w:color w:val="000000"/>
-          <w:sz w:val="24"/>
-          <w:szCs w:val="24"/>
-        </w:rPr>
-        <w:t xml:space="preserve">chaque modalité lève son bâton : plus l’effectif est grand, plus le bâton monte.</w:t>
-      </w:r>
-    </w:p>
-    <w:p>
-      <w:pPr>
-        <w:spacing w:after="110" w:line="300"/>
-        <w:jc w:val="both"/>
-      </w:pPr>
-      <w:r>
-        <w:rPr>
-          <w:rFonts w:ascii="Times New Roman" w:cs="Times New Roman" w:eastAsia="Times New Roman" w:hAnsi="Times New Roman"/>
-          <w:b w:val="false"/>
-          <w:bCs w:val="false"/>
-          <w:i w:val="false"/>
-          <w:iCs w:val="false"/>
-          <w:color w:val="000000"/>
-          <w:sz w:val="24"/>
-          <w:szCs w:val="24"/>
-        </w:rPr>
-        <w:t xml:space="preserve">La construction suit quatre règles : un axe vertical gradué RÉGULIÈREMENT (de 2 en 2, de 5 en 5… jamais au hasard), des bâtons de MÊME largeur, des espaces entre les bâtons (le caractère est discret : les modalités ne se touchent pas), et des étiquettes sous chaque bâton. La lecture inverse est aussi importante que le tracé : retrouver un effectif en suivant le sommet du bâton jusqu’à l’axe. Œil critique : un axe qui ne démarre pas à zéro ou une graduation irrégulière déforment la comparaison — c’est la manipulation graphique la plus répandue dans les publicités !</w:t>
-      </w:r>
-    </w:p>
-    <w:p>
-      <w:pPr>
         <w:spacing w:after="120" w:before="120"/>
         <w:jc w:val="center"/>
       </w:pPr>
       <w:r>
         <w:drawing>
           <wp:inline distT="0" distB="0" distL="0" distR="0">
-            <wp:extent cx="4762500" cy="2305050"/>
+            <wp:extent cx="4095750" cy="2238375"/>
             <wp:effectExtent t="0" r="0" b="0" l="0"/>
-            <wp:docPr id="4" name="" descr="" title=""/>
+            <wp:docPr id="7" name="" descr="" title=""/>
             <wp:cNvGraphicFramePr>
               <a:graphicFrameLocks xmlns:a="http://schemas.openxmlformats.org/drawingml/2006/main" noChangeAspect="1"/>
             </wp:cNvGraphicFramePr>
@@ -11358,7 +11413,136 @@
                     </pic:cNvPicPr>
                   </pic:nvPicPr>
                   <pic:blipFill>
-                    <a:blip r:embed="rId12" cstate="none"/>
+                    <a:blip r:embed="rId15" cstate="none"/>
+                    <a:srcRect/>
+                    <a:stretch>
+                      <a:fillRect/>
+                    </a:stretch>
+                  </pic:blipFill>
+                  <pic:spPr bwMode="auto">
+                    <a:xfrm>
+                      <a:off x="0" y="0"/>
+                      <a:ext cx="4095750" cy="2238375"/>
+                    </a:xfrm>
+                    <a:prstGeom prst="rect">
+                      <a:avLst/>
+                    </a:prstGeom>
+                  </pic:spPr>
+                </pic:pic>
+              </a:graphicData>
+            </a:graphic>
+          </wp:inline>
+        </w:drawing>
+      </w:r>
+    </w:p>
+    <w:p>
+      <w:pPr>
+        <w:spacing w:after="110" w:line="300"/>
+        <w:jc w:val="both"/>
+      </w:pPr>
+      <w:r>
+        <w:rPr>
+          <w:rFonts w:ascii="Times New Roman" w:cs="Times New Roman" w:eastAsia="Times New Roman" w:hAnsi="Times New Roman"/>
+          <w:b/>
+          <w:bCs/>
+          <w:i w:val="false"/>
+          <w:iCs w:val="false"/>
+          <w:color w:val="2E7D32"/>
+          <w:sz w:val="24"/>
+          <w:szCs w:val="24"/>
+        </w:rPr>
+        <w:t xml:space="preserve">Définition — </w:t>
+      </w:r>
+      <w:r>
+        <w:rPr>
+          <w:rFonts w:ascii="Times New Roman" w:cs="Times New Roman" w:eastAsia="Times New Roman" w:hAnsi="Times New Roman"/>
+          <w:b/>
+          <w:bCs/>
+          <w:i w:val="false"/>
+          <w:iCs w:val="false"/>
+          <w:color w:val="000000"/>
+          <w:sz w:val="24"/>
+          <w:szCs w:val="24"/>
+        </w:rPr>
+        <w:t xml:space="preserve">Un diagramme en bâtons représente chaque modalité par un bâton (ou une barre) dont la hauteur est proportionnelle à l’effectif, mesurée sur un axe gradué régulièrement. Les bâtons, de même largeur, sont séparés les uns des autres.</w:t>
+      </w:r>
+    </w:p>
+    <w:p>
+      <w:pPr>
+        <w:spacing w:after="110" w:line="300"/>
+        <w:jc w:val="both"/>
+      </w:pPr>
+      <w:r>
+        <w:rPr>
+          <w:rFonts w:ascii="Times New Roman" w:cs="Times New Roman" w:eastAsia="Times New Roman" w:hAnsi="Times New Roman"/>
+          <w:b/>
+          <w:bCs/>
+          <w:i w:val="false"/>
+          <w:iCs w:val="false"/>
+          <w:color w:val="1F4E79"/>
+          <w:sz w:val="24"/>
+          <w:szCs w:val="24"/>
+        </w:rPr>
+        <w:t xml:space="preserve">Autrement dit : </w:t>
+      </w:r>
+      <w:r>
+        <w:rPr>
+          <w:rFonts w:ascii="Times New Roman" w:cs="Times New Roman" w:eastAsia="Times New Roman" w:hAnsi="Times New Roman"/>
+          <w:b w:val="false"/>
+          <w:bCs w:val="false"/>
+          <w:i w:val="false"/>
+          <w:iCs w:val="false"/>
+          <w:color w:val="000000"/>
+          <w:sz w:val="24"/>
+          <w:szCs w:val="24"/>
+        </w:rPr>
+        <w:t xml:space="preserve">chaque modalité lève son bâton : plus l’effectif est grand, plus le bâton monte.</w:t>
+      </w:r>
+    </w:p>
+    <w:p>
+      <w:pPr>
+        <w:spacing w:after="110" w:line="300"/>
+        <w:jc w:val="both"/>
+      </w:pPr>
+      <w:r>
+        <w:rPr>
+          <w:rFonts w:ascii="Times New Roman" w:cs="Times New Roman" w:eastAsia="Times New Roman" w:hAnsi="Times New Roman"/>
+          <w:b w:val="false"/>
+          <w:bCs w:val="false"/>
+          <w:i w:val="false"/>
+          <w:iCs w:val="false"/>
+          <w:color w:val="000000"/>
+          <w:sz w:val="24"/>
+          <w:szCs w:val="24"/>
+        </w:rPr>
+        <w:t xml:space="preserve">La construction suit quatre règles : un axe vertical gradué RÉGULIÈREMENT (de 2 en 2, de 5 en 5… jamais au hasard), des bâtons de MÊME largeur, des espaces entre les bâtons (le caractère est discret : les modalités ne se touchent pas), et des étiquettes sous chaque bâton. La lecture inverse est aussi importante que le tracé : retrouver un effectif en suivant le sommet du bâton jusqu’à l’axe. Œil critique : un axe qui ne démarre pas à zéro ou une graduation irrégulière déforment la comparaison — c’est la manipulation graphique la plus répandue dans les publicités !</w:t>
+      </w:r>
+    </w:p>
+    <w:p>
+      <w:pPr>
+        <w:spacing w:after="120" w:before="120"/>
+        <w:jc w:val="center"/>
+      </w:pPr>
+      <w:r>
+        <w:drawing>
+          <wp:inline distT="0" distB="0" distL="0" distR="0">
+            <wp:extent cx="4762500" cy="2305050"/>
+            <wp:effectExtent t="0" r="0" b="0" l="0"/>
+            <wp:docPr id="8" name="" descr="" title=""/>
+            <wp:cNvGraphicFramePr>
+              <a:graphicFrameLocks xmlns:a="http://schemas.openxmlformats.org/drawingml/2006/main" noChangeAspect="1"/>
+            </wp:cNvGraphicFramePr>
+            <a:graphic xmlns:a="http://schemas.openxmlformats.org/drawingml/2006/main">
+              <a:graphicData uri="http://schemas.openxmlformats.org/drawingml/2006/picture">
+                <pic:pic xmlns:pic="http://schemas.openxmlformats.org/drawingml/2006/picture">
+                  <pic:nvPicPr>
+                    <pic:cNvPr id="0" name="" descr=""/>
+                    <pic:cNvPicPr>
+                      <a:picLocks noChangeAspect="1" noChangeArrowheads="1"/>
+                    </pic:cNvPicPr>
+                  </pic:nvPicPr>
+                  <pic:blipFill>
+                    <a:blip r:embed="rId16" cstate="none"/>
                     <a:srcRect/>
                     <a:stretch>
                       <a:fillRect/>
@@ -14264,6 +14448,52 @@
     </w:p>
     <w:p>
       <w:pPr>
+        <w:spacing w:after="120" w:before="120"/>
+        <w:jc w:val="center"/>
+      </w:pPr>
+      <w:r>
+        <w:drawing>
+          <wp:inline distT="0" distB="0" distL="0" distR="0">
+            <wp:extent cx="4095750" cy="2238375"/>
+            <wp:effectExtent t="0" r="0" b="0" l="0"/>
+            <wp:docPr id="9" name="" descr="" title=""/>
+            <wp:cNvGraphicFramePr>
+              <a:graphicFrameLocks xmlns:a="http://schemas.openxmlformats.org/drawingml/2006/main" noChangeAspect="1"/>
+            </wp:cNvGraphicFramePr>
+            <a:graphic xmlns:a="http://schemas.openxmlformats.org/drawingml/2006/main">
+              <a:graphicData uri="http://schemas.openxmlformats.org/drawingml/2006/picture">
+                <pic:pic xmlns:pic="http://schemas.openxmlformats.org/drawingml/2006/picture">
+                  <pic:nvPicPr>
+                    <pic:cNvPr id="0" name="" descr=""/>
+                    <pic:cNvPicPr>
+                      <a:picLocks noChangeAspect="1" noChangeArrowheads="1"/>
+                    </pic:cNvPicPr>
+                  </pic:nvPicPr>
+                  <pic:blipFill>
+                    <a:blip r:embed="rId17" cstate="none"/>
+                    <a:srcRect/>
+                    <a:stretch>
+                      <a:fillRect/>
+                    </a:stretch>
+                  </pic:blipFill>
+                  <pic:spPr bwMode="auto">
+                    <a:xfrm>
+                      <a:off x="0" y="0"/>
+                      <a:ext cx="4095750" cy="2238375"/>
+                    </a:xfrm>
+                    <a:prstGeom prst="rect">
+                      <a:avLst/>
+                    </a:prstGeom>
+                  </pic:spPr>
+                </pic:pic>
+              </a:graphicData>
+            </a:graphic>
+          </wp:inline>
+        </w:drawing>
+      </w:r>
+    </w:p>
+    <w:p>
+      <w:pPr>
         <w:spacing w:after="110" w:line="300"/>
         <w:jc w:val="both"/>
       </w:pPr>
@@ -14409,7 +14639,7 @@
           <wp:inline distT="0" distB="0" distL="0" distR="0">
             <wp:extent cx="4762500" cy="2543175"/>
             <wp:effectExtent t="0" r="0" b="0" l="0"/>
-            <wp:docPr id="5" name="" descr="" title=""/>
+            <wp:docPr id="10" name="" descr="" title=""/>
             <wp:cNvGraphicFramePr>
               <a:graphicFrameLocks xmlns:a="http://schemas.openxmlformats.org/drawingml/2006/main" noChangeAspect="1"/>
             </wp:cNvGraphicFramePr>
@@ -14423,7 +14653,7 @@
                     </pic:cNvPicPr>
                   </pic:nvPicPr>
                   <pic:blipFill>
-                    <a:blip r:embed="rId13" cstate="none"/>
+                    <a:blip r:embed="rId18" cstate="none"/>
                     <a:srcRect/>
                     <a:stretch>
                       <a:fillRect/>
@@ -17275,98 +17505,15 @@
     </w:p>
     <w:p>
       <w:pPr>
-        <w:spacing w:after="110" w:line="300"/>
-        <w:jc w:val="both"/>
-      </w:pPr>
-      <w:r>
-        <w:rPr>
-          <w:rFonts w:ascii="Times New Roman" w:cs="Times New Roman" w:eastAsia="Times New Roman" w:hAnsi="Times New Roman"/>
-          <w:b/>
-          <w:bCs/>
-          <w:i w:val="false"/>
-          <w:iCs w:val="false"/>
-          <w:color w:val="2E7D32"/>
-          <w:sz w:val="24"/>
-          <w:szCs w:val="24"/>
-        </w:rPr>
-        <w:t xml:space="preserve">Définition — </w:t>
-      </w:r>
-      <w:r>
-        <w:rPr>
-          <w:rFonts w:ascii="Times New Roman" w:cs="Times New Roman" w:eastAsia="Times New Roman" w:hAnsi="Times New Roman"/>
-          <w:b/>
-          <w:bCs/>
-          <w:i w:val="false"/>
-          <w:iCs w:val="false"/>
-          <w:color w:val="000000"/>
-          <w:sz w:val="24"/>
-          <w:szCs w:val="24"/>
-        </w:rPr>
-        <w:t xml:space="preserve">Un histogramme représente un caractère quantitatif groupé en classes d’égale largeur : chaque classe est figurée par un rectangle dont la hauteur est proportionnelle à son effectif ; les rectangles sont accolés car les classes se suivent sans interruption.</w:t>
-      </w:r>
-    </w:p>
-    <w:p>
-      <w:pPr>
-        <w:spacing w:after="110" w:line="300"/>
-        <w:jc w:val="both"/>
-      </w:pPr>
-      <w:r>
-        <w:rPr>
-          <w:rFonts w:ascii="Times New Roman" w:cs="Times New Roman" w:eastAsia="Times New Roman" w:hAnsi="Times New Roman"/>
-          <w:b/>
-          <w:bCs/>
-          <w:i w:val="false"/>
-          <w:iCs w:val="false"/>
-          <w:color w:val="1F4E79"/>
-          <w:sz w:val="24"/>
-          <w:szCs w:val="24"/>
-        </w:rPr>
-        <w:t xml:space="preserve">Autrement dit : </w:t>
-      </w:r>
-      <w:r>
-        <w:rPr>
-          <w:rFonts w:ascii="Times New Roman" w:cs="Times New Roman" w:eastAsia="Times New Roman" w:hAnsi="Times New Roman"/>
-          <w:b w:val="false"/>
-          <w:bCs w:val="false"/>
-          <w:i w:val="false"/>
-          <w:iCs w:val="false"/>
-          <w:color w:val="000000"/>
-          <w:sz w:val="24"/>
-          <w:szCs w:val="24"/>
-        </w:rPr>
-        <w:t xml:space="preserve">on range les valeurs dans des tiroirs qui se suivent, puis on dessine les tiroirs côte à côte, remplis à hauteur de leur effectif.</w:t>
-      </w:r>
-    </w:p>
-    <w:p>
-      <w:pPr>
-        <w:spacing w:after="110" w:line="300"/>
-        <w:jc w:val="both"/>
-      </w:pPr>
-      <w:r>
-        <w:rPr>
-          <w:rFonts w:ascii="Times New Roman" w:cs="Times New Roman" w:eastAsia="Times New Roman" w:hAnsi="Times New Roman"/>
-          <w:b w:val="false"/>
-          <w:bCs w:val="false"/>
-          <w:i w:val="false"/>
-          <w:iCs w:val="false"/>
-          <w:color w:val="000000"/>
-          <w:sz w:val="24"/>
-          <w:szCs w:val="24"/>
-        </w:rPr>
-        <w:t xml:space="preserve">La démarche : choisir des classes d’égale largeur couvrant toutes les valeurs (de 140 à 160 par pas de 5 cm), ranger chaque mesure dans sa classe — convention : la borne gauche est incluse, la droite exclue, ainsi 150 cm va dans [150 ; 155[ —, dresser le tableau des effectifs par classe, tracer les rectangles ACCOLÉS. L’histogramme révèle la forme de la répartition : où se masse la population, où sont les extrêmes. Le regroupement a un prix : on perd le détail des valeurs individuelles — compromis classique entre lisibilité et précision.</w:t>
-      </w:r>
-    </w:p>
-    <w:p>
-      <w:pPr>
         <w:spacing w:after="120" w:before="120"/>
         <w:jc w:val="center"/>
       </w:pPr>
       <w:r>
         <w:drawing>
           <wp:inline distT="0" distB="0" distL="0" distR="0">
-            <wp:extent cx="4762500" cy="2409825"/>
+            <wp:extent cx="4095750" cy="2238375"/>
             <wp:effectExtent t="0" r="0" b="0" l="0"/>
-            <wp:docPr id="6" name="" descr="" title=""/>
+            <wp:docPr id="11" name="" descr="" title=""/>
             <wp:cNvGraphicFramePr>
               <a:graphicFrameLocks xmlns:a="http://schemas.openxmlformats.org/drawingml/2006/main" noChangeAspect="1"/>
             </wp:cNvGraphicFramePr>
@@ -17380,7 +17527,136 @@
                     </pic:cNvPicPr>
                   </pic:nvPicPr>
                   <pic:blipFill>
-                    <a:blip r:embed="rId14" cstate="none"/>
+                    <a:blip r:embed="rId19" cstate="none"/>
+                    <a:srcRect/>
+                    <a:stretch>
+                      <a:fillRect/>
+                    </a:stretch>
+                  </pic:blipFill>
+                  <pic:spPr bwMode="auto">
+                    <a:xfrm>
+                      <a:off x="0" y="0"/>
+                      <a:ext cx="4095750" cy="2238375"/>
+                    </a:xfrm>
+                    <a:prstGeom prst="rect">
+                      <a:avLst/>
+                    </a:prstGeom>
+                  </pic:spPr>
+                </pic:pic>
+              </a:graphicData>
+            </a:graphic>
+          </wp:inline>
+        </w:drawing>
+      </w:r>
+    </w:p>
+    <w:p>
+      <w:pPr>
+        <w:spacing w:after="110" w:line="300"/>
+        <w:jc w:val="both"/>
+      </w:pPr>
+      <w:r>
+        <w:rPr>
+          <w:rFonts w:ascii="Times New Roman" w:cs="Times New Roman" w:eastAsia="Times New Roman" w:hAnsi="Times New Roman"/>
+          <w:b/>
+          <w:bCs/>
+          <w:i w:val="false"/>
+          <w:iCs w:val="false"/>
+          <w:color w:val="2E7D32"/>
+          <w:sz w:val="24"/>
+          <w:szCs w:val="24"/>
+        </w:rPr>
+        <w:t xml:space="preserve">Définition — </w:t>
+      </w:r>
+      <w:r>
+        <w:rPr>
+          <w:rFonts w:ascii="Times New Roman" w:cs="Times New Roman" w:eastAsia="Times New Roman" w:hAnsi="Times New Roman"/>
+          <w:b/>
+          <w:bCs/>
+          <w:i w:val="false"/>
+          <w:iCs w:val="false"/>
+          <w:color w:val="000000"/>
+          <w:sz w:val="24"/>
+          <w:szCs w:val="24"/>
+        </w:rPr>
+        <w:t xml:space="preserve">Un histogramme représente un caractère quantitatif groupé en classes d’égale largeur : chaque classe est figurée par un rectangle dont la hauteur est proportionnelle à son effectif ; les rectangles sont accolés car les classes se suivent sans interruption.</w:t>
+      </w:r>
+    </w:p>
+    <w:p>
+      <w:pPr>
+        <w:spacing w:after="110" w:line="300"/>
+        <w:jc w:val="both"/>
+      </w:pPr>
+      <w:r>
+        <w:rPr>
+          <w:rFonts w:ascii="Times New Roman" w:cs="Times New Roman" w:eastAsia="Times New Roman" w:hAnsi="Times New Roman"/>
+          <w:b/>
+          <w:bCs/>
+          <w:i w:val="false"/>
+          <w:iCs w:val="false"/>
+          <w:color w:val="1F4E79"/>
+          <w:sz w:val="24"/>
+          <w:szCs w:val="24"/>
+        </w:rPr>
+        <w:t xml:space="preserve">Autrement dit : </w:t>
+      </w:r>
+      <w:r>
+        <w:rPr>
+          <w:rFonts w:ascii="Times New Roman" w:cs="Times New Roman" w:eastAsia="Times New Roman" w:hAnsi="Times New Roman"/>
+          <w:b w:val="false"/>
+          <w:bCs w:val="false"/>
+          <w:i w:val="false"/>
+          <w:iCs w:val="false"/>
+          <w:color w:val="000000"/>
+          <w:sz w:val="24"/>
+          <w:szCs w:val="24"/>
+        </w:rPr>
+        <w:t xml:space="preserve">on range les valeurs dans des tiroirs qui se suivent, puis on dessine les tiroirs côte à côte, remplis à hauteur de leur effectif.</w:t>
+      </w:r>
+    </w:p>
+    <w:p>
+      <w:pPr>
+        <w:spacing w:after="110" w:line="300"/>
+        <w:jc w:val="both"/>
+      </w:pPr>
+      <w:r>
+        <w:rPr>
+          <w:rFonts w:ascii="Times New Roman" w:cs="Times New Roman" w:eastAsia="Times New Roman" w:hAnsi="Times New Roman"/>
+          <w:b w:val="false"/>
+          <w:bCs w:val="false"/>
+          <w:i w:val="false"/>
+          <w:iCs w:val="false"/>
+          <w:color w:val="000000"/>
+          <w:sz w:val="24"/>
+          <w:szCs w:val="24"/>
+        </w:rPr>
+        <w:t xml:space="preserve">La démarche : choisir des classes d’égale largeur couvrant toutes les valeurs (de 140 à 160 par pas de 5 cm), ranger chaque mesure dans sa classe — convention : la borne gauche est incluse, la droite exclue, ainsi 150 cm va dans [150 ; 155[ —, dresser le tableau des effectifs par classe, tracer les rectangles ACCOLÉS. L’histogramme révèle la forme de la répartition : où se masse la population, où sont les extrêmes. Le regroupement a un prix : on perd le détail des valeurs individuelles — compromis classique entre lisibilité et précision.</w:t>
+      </w:r>
+    </w:p>
+    <w:p>
+      <w:pPr>
+        <w:spacing w:after="120" w:before="120"/>
+        <w:jc w:val="center"/>
+      </w:pPr>
+      <w:r>
+        <w:drawing>
+          <wp:inline distT="0" distB="0" distL="0" distR="0">
+            <wp:extent cx="4762500" cy="2409825"/>
+            <wp:effectExtent t="0" r="0" b="0" l="0"/>
+            <wp:docPr id="12" name="" descr="" title=""/>
+            <wp:cNvGraphicFramePr>
+              <a:graphicFrameLocks xmlns:a="http://schemas.openxmlformats.org/drawingml/2006/main" noChangeAspect="1"/>
+            </wp:cNvGraphicFramePr>
+            <a:graphic xmlns:a="http://schemas.openxmlformats.org/drawingml/2006/main">
+              <a:graphicData uri="http://schemas.openxmlformats.org/drawingml/2006/picture">
+                <pic:pic xmlns:pic="http://schemas.openxmlformats.org/drawingml/2006/picture">
+                  <pic:nvPicPr>
+                    <pic:cNvPr id="0" name="" descr=""/>
+                    <pic:cNvPicPr>
+                      <a:picLocks noChangeAspect="1" noChangeArrowheads="1"/>
+                    </pic:cNvPicPr>
+                  </pic:nvPicPr>
+                  <pic:blipFill>
+                    <a:blip r:embed="rId20" cstate="none"/>
                     <a:srcRect/>
                     <a:stretch>
                       <a:fillRect/>
@@ -20313,6 +20589,52 @@
     </w:p>
     <w:p>
       <w:pPr>
+        <w:spacing w:after="120" w:before="120"/>
+        <w:jc w:val="center"/>
+      </w:pPr>
+      <w:r>
+        <w:drawing>
+          <wp:inline distT="0" distB="0" distL="0" distR="0">
+            <wp:extent cx="4095750" cy="2238375"/>
+            <wp:effectExtent t="0" r="0" b="0" l="0"/>
+            <wp:docPr id="13" name="" descr="" title=""/>
+            <wp:cNvGraphicFramePr>
+              <a:graphicFrameLocks xmlns:a="http://schemas.openxmlformats.org/drawingml/2006/main" noChangeAspect="1"/>
+            </wp:cNvGraphicFramePr>
+            <a:graphic xmlns:a="http://schemas.openxmlformats.org/drawingml/2006/main">
+              <a:graphicData uri="http://schemas.openxmlformats.org/drawingml/2006/picture">
+                <pic:pic xmlns:pic="http://schemas.openxmlformats.org/drawingml/2006/picture">
+                  <pic:nvPicPr>
+                    <pic:cNvPr id="0" name="" descr=""/>
+                    <pic:cNvPicPr>
+                      <a:picLocks noChangeAspect="1" noChangeArrowheads="1"/>
+                    </pic:cNvPicPr>
+                  </pic:nvPicPr>
+                  <pic:blipFill>
+                    <a:blip r:embed="rId21" cstate="none"/>
+                    <a:srcRect/>
+                    <a:stretch>
+                      <a:fillRect/>
+                    </a:stretch>
+                  </pic:blipFill>
+                  <pic:spPr bwMode="auto">
+                    <a:xfrm>
+                      <a:off x="0" y="0"/>
+                      <a:ext cx="4095750" cy="2238375"/>
+                    </a:xfrm>
+                    <a:prstGeom prst="rect">
+                      <a:avLst/>
+                    </a:prstGeom>
+                  </pic:spPr>
+                </pic:pic>
+              </a:graphicData>
+            </a:graphic>
+          </wp:inline>
+        </w:drawing>
+      </w:r>
+    </w:p>
+    <w:p>
+      <w:pPr>
         <w:spacing w:after="110" w:line="300"/>
         <w:jc w:val="both"/>
       </w:pPr>
@@ -20485,7 +20807,7 @@
           <wp:inline distT="0" distB="0" distL="0" distR="0">
             <wp:extent cx="4762500" cy="1714500"/>
             <wp:effectExtent t="0" r="0" b="0" l="0"/>
-            <wp:docPr id="7" name="" descr="" title=""/>
+            <wp:docPr id="14" name="" descr="" title=""/>
             <wp:cNvGraphicFramePr>
               <a:graphicFrameLocks xmlns:a="http://schemas.openxmlformats.org/drawingml/2006/main" noChangeAspect="1"/>
             </wp:cNvGraphicFramePr>
@@ -20499,7 +20821,7 @@
                     </pic:cNvPicPr>
                   </pic:nvPicPr>
                   <pic:blipFill>
-                    <a:blip r:embed="rId15" cstate="none"/>
+                    <a:blip r:embed="rId22" cstate="none"/>
                     <a:srcRect/>
                     <a:stretch>
                       <a:fillRect/>
@@ -23297,98 +23619,15 @@
     </w:p>
     <w:p>
       <w:pPr>
-        <w:spacing w:after="110" w:line="300"/>
-        <w:jc w:val="both"/>
-      </w:pPr>
-      <w:r>
-        <w:rPr>
-          <w:rFonts w:ascii="Times New Roman" w:cs="Times New Roman" w:eastAsia="Times New Roman" w:hAnsi="Times New Roman"/>
-          <w:b/>
-          <w:bCs/>
-          <w:i w:val="false"/>
-          <w:iCs w:val="false"/>
-          <w:color w:val="2E7D32"/>
-          <w:sz w:val="24"/>
-          <w:szCs w:val="24"/>
-        </w:rPr>
-        <w:t xml:space="preserve">Définition — </w:t>
-      </w:r>
-      <w:r>
-        <w:rPr>
-          <w:rFonts w:ascii="Times New Roman" w:cs="Times New Roman" w:eastAsia="Times New Roman" w:hAnsi="Times New Roman"/>
-          <w:b/>
-          <w:bCs/>
-          <w:i w:val="false"/>
-          <w:iCs w:val="false"/>
-          <w:color w:val="000000"/>
-          <w:sz w:val="24"/>
-          <w:szCs w:val="24"/>
-        </w:rPr>
-        <w:t xml:space="preserve">La moyenne d’une série est la somme de toutes les valeurs divisée par l’effectif total. Lorsque les valeurs sont données avec leurs effectifs, la moyenne pondérée se calcule ainsi : moyenne = (somme des valeur × effectif) ÷ effectif total.</w:t>
-      </w:r>
-    </w:p>
-    <w:p>
-      <w:pPr>
-        <w:spacing w:after="110" w:line="300"/>
-        <w:jc w:val="both"/>
-      </w:pPr>
-      <w:r>
-        <w:rPr>
-          <w:rFonts w:ascii="Times New Roman" w:cs="Times New Roman" w:eastAsia="Times New Roman" w:hAnsi="Times New Roman"/>
-          <w:b/>
-          <w:bCs/>
-          <w:i w:val="false"/>
-          <w:iCs w:val="false"/>
-          <w:color w:val="1F4E79"/>
-          <w:sz w:val="24"/>
-          <w:szCs w:val="24"/>
-        </w:rPr>
-        <w:t xml:space="preserve">Autrement dit : </w:t>
-      </w:r>
-      <w:r>
-        <w:rPr>
-          <w:rFonts w:ascii="Times New Roman" w:cs="Times New Roman" w:eastAsia="Times New Roman" w:hAnsi="Times New Roman"/>
-          <w:b w:val="false"/>
-          <w:bCs w:val="false"/>
-          <w:i w:val="false"/>
-          <w:iCs w:val="false"/>
-          <w:color w:val="000000"/>
-          <w:sz w:val="24"/>
-          <w:szCs w:val="24"/>
-        </w:rPr>
-        <w:t xml:space="preserve">la moyenne répartit le total équitablement : « si tout le monde avait pareil, chacun aurait la moyenne ».</w:t>
-      </w:r>
-    </w:p>
-    <w:p>
-      <w:pPr>
-        <w:spacing w:after="110" w:line="300"/>
-        <w:jc w:val="both"/>
-      </w:pPr>
-      <w:r>
-        <w:rPr>
-          <w:rFonts w:ascii="Times New Roman" w:cs="Times New Roman" w:eastAsia="Times New Roman" w:hAnsi="Times New Roman"/>
-          <w:b w:val="false"/>
-          <w:bCs w:val="false"/>
-          <w:i w:val="false"/>
-          <w:iCs w:val="false"/>
-          <w:color w:val="000000"/>
-          <w:sz w:val="24"/>
-          <w:szCs w:val="24"/>
-        </w:rPr>
-        <w:t xml:space="preserve">Le calcul pondéré organise tout en tableau : une ligne valeur × effectif (8×3 = 24, 10×5 = 50, 12×8 = 96, 15×4 = 60), la somme 230, la division par l’effectif total 20 → moyenne 11,5. Deux contrôles de bon sens : la moyenne tombe TOUJOURS entre la plus petite et la plus grande valeur ; et elle penche vers les valeurs les plus nombreuses. Finesse à connaître : la moyenne n’est pas forcément une valeur de la série (aucun élève n’a 11,5 !) et elle est sensible aux extrêmes — un seul 0 peut faire chuter toute une moyenne, c’est sa force et sa faiblesse.</w:t>
-      </w:r>
-    </w:p>
-    <w:p>
-      <w:pPr>
         <w:spacing w:after="120" w:before="120"/>
         <w:jc w:val="center"/>
       </w:pPr>
       <w:r>
         <w:drawing>
           <wp:inline distT="0" distB="0" distL="0" distR="0">
-            <wp:extent cx="4762500" cy="1971675"/>
+            <wp:extent cx="4095750" cy="2238375"/>
             <wp:effectExtent t="0" r="0" b="0" l="0"/>
-            <wp:docPr id="8" name="" descr="" title=""/>
+            <wp:docPr id="15" name="" descr="" title=""/>
             <wp:cNvGraphicFramePr>
               <a:graphicFrameLocks xmlns:a="http://schemas.openxmlformats.org/drawingml/2006/main" noChangeAspect="1"/>
             </wp:cNvGraphicFramePr>
@@ -23402,7 +23641,136 @@
                     </pic:cNvPicPr>
                   </pic:nvPicPr>
                   <pic:blipFill>
-                    <a:blip r:embed="rId16" cstate="none"/>
+                    <a:blip r:embed="rId23" cstate="none"/>
+                    <a:srcRect/>
+                    <a:stretch>
+                      <a:fillRect/>
+                    </a:stretch>
+                  </pic:blipFill>
+                  <pic:spPr bwMode="auto">
+                    <a:xfrm>
+                      <a:off x="0" y="0"/>
+                      <a:ext cx="4095750" cy="2238375"/>
+                    </a:xfrm>
+                    <a:prstGeom prst="rect">
+                      <a:avLst/>
+                    </a:prstGeom>
+                  </pic:spPr>
+                </pic:pic>
+              </a:graphicData>
+            </a:graphic>
+          </wp:inline>
+        </w:drawing>
+      </w:r>
+    </w:p>
+    <w:p>
+      <w:pPr>
+        <w:spacing w:after="110" w:line="300"/>
+        <w:jc w:val="both"/>
+      </w:pPr>
+      <w:r>
+        <w:rPr>
+          <w:rFonts w:ascii="Times New Roman" w:cs="Times New Roman" w:eastAsia="Times New Roman" w:hAnsi="Times New Roman"/>
+          <w:b/>
+          <w:bCs/>
+          <w:i w:val="false"/>
+          <w:iCs w:val="false"/>
+          <w:color w:val="2E7D32"/>
+          <w:sz w:val="24"/>
+          <w:szCs w:val="24"/>
+        </w:rPr>
+        <w:t xml:space="preserve">Définition — </w:t>
+      </w:r>
+      <w:r>
+        <w:rPr>
+          <w:rFonts w:ascii="Times New Roman" w:cs="Times New Roman" w:eastAsia="Times New Roman" w:hAnsi="Times New Roman"/>
+          <w:b/>
+          <w:bCs/>
+          <w:i w:val="false"/>
+          <w:iCs w:val="false"/>
+          <w:color w:val="000000"/>
+          <w:sz w:val="24"/>
+          <w:szCs w:val="24"/>
+        </w:rPr>
+        <w:t xml:space="preserve">La moyenne d’une série est la somme de toutes les valeurs divisée par l’effectif total. Lorsque les valeurs sont données avec leurs effectifs, la moyenne pondérée se calcule ainsi : moyenne = (somme des valeur × effectif) ÷ effectif total.</w:t>
+      </w:r>
+    </w:p>
+    <w:p>
+      <w:pPr>
+        <w:spacing w:after="110" w:line="300"/>
+        <w:jc w:val="both"/>
+      </w:pPr>
+      <w:r>
+        <w:rPr>
+          <w:rFonts w:ascii="Times New Roman" w:cs="Times New Roman" w:eastAsia="Times New Roman" w:hAnsi="Times New Roman"/>
+          <w:b/>
+          <w:bCs/>
+          <w:i w:val="false"/>
+          <w:iCs w:val="false"/>
+          <w:color w:val="1F4E79"/>
+          <w:sz w:val="24"/>
+          <w:szCs w:val="24"/>
+        </w:rPr>
+        <w:t xml:space="preserve">Autrement dit : </w:t>
+      </w:r>
+      <w:r>
+        <w:rPr>
+          <w:rFonts w:ascii="Times New Roman" w:cs="Times New Roman" w:eastAsia="Times New Roman" w:hAnsi="Times New Roman"/>
+          <w:b w:val="false"/>
+          <w:bCs w:val="false"/>
+          <w:i w:val="false"/>
+          <w:iCs w:val="false"/>
+          <w:color w:val="000000"/>
+          <w:sz w:val="24"/>
+          <w:szCs w:val="24"/>
+        </w:rPr>
+        <w:t xml:space="preserve">la moyenne répartit le total équitablement : « si tout le monde avait pareil, chacun aurait la moyenne ».</w:t>
+      </w:r>
+    </w:p>
+    <w:p>
+      <w:pPr>
+        <w:spacing w:after="110" w:line="300"/>
+        <w:jc w:val="both"/>
+      </w:pPr>
+      <w:r>
+        <w:rPr>
+          <w:rFonts w:ascii="Times New Roman" w:cs="Times New Roman" w:eastAsia="Times New Roman" w:hAnsi="Times New Roman"/>
+          <w:b w:val="false"/>
+          <w:bCs w:val="false"/>
+          <w:i w:val="false"/>
+          <w:iCs w:val="false"/>
+          <w:color w:val="000000"/>
+          <w:sz w:val="24"/>
+          <w:szCs w:val="24"/>
+        </w:rPr>
+        <w:t xml:space="preserve">Le calcul pondéré organise tout en tableau : une ligne valeur × effectif (8×3 = 24, 10×5 = 50, 12×8 = 96, 15×4 = 60), la somme 230, la division par l’effectif total 20 → moyenne 11,5. Deux contrôles de bon sens : la moyenne tombe TOUJOURS entre la plus petite et la plus grande valeur ; et elle penche vers les valeurs les plus nombreuses. Finesse à connaître : la moyenne n’est pas forcément une valeur de la série (aucun élève n’a 11,5 !) et elle est sensible aux extrêmes — un seul 0 peut faire chuter toute une moyenne, c’est sa force et sa faiblesse.</w:t>
+      </w:r>
+    </w:p>
+    <w:p>
+      <w:pPr>
+        <w:spacing w:after="120" w:before="120"/>
+        <w:jc w:val="center"/>
+      </w:pPr>
+      <w:r>
+        <w:drawing>
+          <wp:inline distT="0" distB="0" distL="0" distR="0">
+            <wp:extent cx="4762500" cy="1971675"/>
+            <wp:effectExtent t="0" r="0" b="0" l="0"/>
+            <wp:docPr id="16" name="" descr="" title=""/>
+            <wp:cNvGraphicFramePr>
+              <a:graphicFrameLocks xmlns:a="http://schemas.openxmlformats.org/drawingml/2006/main" noChangeAspect="1"/>
+            </wp:cNvGraphicFramePr>
+            <a:graphic xmlns:a="http://schemas.openxmlformats.org/drawingml/2006/main">
+              <a:graphicData uri="http://schemas.openxmlformats.org/drawingml/2006/picture">
+                <pic:pic xmlns:pic="http://schemas.openxmlformats.org/drawingml/2006/picture">
+                  <pic:nvPicPr>
+                    <pic:cNvPr id="0" name="" descr=""/>
+                    <pic:cNvPicPr>
+                      <a:picLocks noChangeAspect="1" noChangeArrowheads="1"/>
+                    </pic:cNvPicPr>
+                  </pic:nvPicPr>
+                  <pic:blipFill>
+                    <a:blip r:embed="rId24" cstate="none"/>
                     <a:srcRect/>
                     <a:stretch>
                       <a:fillRect/>
@@ -26632,6 +27000,52 @@
     </w:p>
     <w:p>
       <w:pPr>
+        <w:spacing w:after="120" w:before="120"/>
+        <w:jc w:val="center"/>
+      </w:pPr>
+      <w:r>
+        <w:drawing>
+          <wp:inline distT="0" distB="0" distL="0" distR="0">
+            <wp:extent cx="4095750" cy="2238375"/>
+            <wp:effectExtent t="0" r="0" b="0" l="0"/>
+            <wp:docPr id="17" name="" descr="" title=""/>
+            <wp:cNvGraphicFramePr>
+              <a:graphicFrameLocks xmlns:a="http://schemas.openxmlformats.org/drawingml/2006/main" noChangeAspect="1"/>
+            </wp:cNvGraphicFramePr>
+            <a:graphic xmlns:a="http://schemas.openxmlformats.org/drawingml/2006/main">
+              <a:graphicData uri="http://schemas.openxmlformats.org/drawingml/2006/picture">
+                <pic:pic xmlns:pic="http://schemas.openxmlformats.org/drawingml/2006/picture">
+                  <pic:nvPicPr>
+                    <pic:cNvPr id="0" name="" descr=""/>
+                    <pic:cNvPicPr>
+                      <a:picLocks noChangeAspect="1" noChangeArrowheads="1"/>
+                    </pic:cNvPicPr>
+                  </pic:nvPicPr>
+                  <pic:blipFill>
+                    <a:blip r:embed="rId25" cstate="none"/>
+                    <a:srcRect/>
+                    <a:stretch>
+                      <a:fillRect/>
+                    </a:stretch>
+                  </pic:blipFill>
+                  <pic:spPr bwMode="auto">
+                    <a:xfrm>
+                      <a:off x="0" y="0"/>
+                      <a:ext cx="4095750" cy="2238375"/>
+                    </a:xfrm>
+                    <a:prstGeom prst="rect">
+                      <a:avLst/>
+                    </a:prstGeom>
+                  </pic:spPr>
+                </pic:pic>
+              </a:graphicData>
+            </a:graphic>
+          </wp:inline>
+        </w:drawing>
+      </w:r>
+    </w:p>
+    <w:p>
+      <w:pPr>
         <w:spacing w:after="110" w:line="300"/>
         <w:jc w:val="both"/>
       </w:pPr>
@@ -26777,7 +27191,7 @@
           <wp:inline distT="0" distB="0" distL="0" distR="0">
             <wp:extent cx="4762500" cy="1933575"/>
             <wp:effectExtent t="0" r="0" b="0" l="0"/>
-            <wp:docPr id="9" name="" descr="" title=""/>
+            <wp:docPr id="18" name="" descr="" title=""/>
             <wp:cNvGraphicFramePr>
               <a:graphicFrameLocks xmlns:a="http://schemas.openxmlformats.org/drawingml/2006/main" noChangeAspect="1"/>
             </wp:cNvGraphicFramePr>
@@ -26791,7 +27205,7 @@
                     </pic:cNvPicPr>
                   </pic:nvPicPr>
                   <pic:blipFill>
-                    <a:blip r:embed="rId17" cstate="none"/>
+                    <a:blip r:embed="rId26" cstate="none"/>
                     <a:srcRect/>
                     <a:stretch>
                       <a:fillRect/>
@@ -30521,6 +30935,52 @@
     </w:p>
     <w:p>
       <w:pPr>
+        <w:spacing w:after="120" w:before="120"/>
+        <w:jc w:val="center"/>
+      </w:pPr>
+      <w:r>
+        <w:drawing>
+          <wp:inline distT="0" distB="0" distL="0" distR="0">
+            <wp:extent cx="4095750" cy="2238375"/>
+            <wp:effectExtent t="0" r="0" b="0" l="0"/>
+            <wp:docPr id="19" name="" descr="" title=""/>
+            <wp:cNvGraphicFramePr>
+              <a:graphicFrameLocks xmlns:a="http://schemas.openxmlformats.org/drawingml/2006/main" noChangeAspect="1"/>
+            </wp:cNvGraphicFramePr>
+            <a:graphic xmlns:a="http://schemas.openxmlformats.org/drawingml/2006/main">
+              <a:graphicData uri="http://schemas.openxmlformats.org/drawingml/2006/picture">
+                <pic:pic xmlns:pic="http://schemas.openxmlformats.org/drawingml/2006/picture">
+                  <pic:nvPicPr>
+                    <pic:cNvPr id="0" name="" descr=""/>
+                    <pic:cNvPicPr>
+                      <a:picLocks noChangeAspect="1" noChangeArrowheads="1"/>
+                    </pic:cNvPicPr>
+                  </pic:nvPicPr>
+                  <pic:blipFill>
+                    <a:blip r:embed="rId27" cstate="none"/>
+                    <a:srcRect/>
+                    <a:stretch>
+                      <a:fillRect/>
+                    </a:stretch>
+                  </pic:blipFill>
+                  <pic:spPr bwMode="auto">
+                    <a:xfrm>
+                      <a:off x="0" y="0"/>
+                      <a:ext cx="4095750" cy="2238375"/>
+                    </a:xfrm>
+                    <a:prstGeom prst="rect">
+                      <a:avLst/>
+                    </a:prstGeom>
+                  </pic:spPr>
+                </pic:pic>
+              </a:graphicData>
+            </a:graphic>
+          </wp:inline>
+        </w:drawing>
+      </w:r>
+    </w:p>
+    <w:p>
+      <w:pPr>
         <w:spacing w:after="110" w:line="300"/>
         <w:jc w:val="both"/>
       </w:pPr>
@@ -30747,7 +31207,7 @@
           <wp:inline distT="0" distB="0" distL="0" distR="0">
             <wp:extent cx="4762500" cy="1714500"/>
             <wp:effectExtent t="0" r="0" b="0" l="0"/>
-            <wp:docPr id="10" name="" descr="" title=""/>
+            <wp:docPr id="20" name="" descr="" title=""/>
             <wp:cNvGraphicFramePr>
               <a:graphicFrameLocks xmlns:a="http://schemas.openxmlformats.org/drawingml/2006/main" noChangeAspect="1"/>
             </wp:cNvGraphicFramePr>
@@ -30761,7 +31221,7 @@
                     </pic:cNvPicPr>
                   </pic:nvPicPr>
                   <pic:blipFill>
-                    <a:blip r:embed="rId18" cstate="none"/>
+                    <a:blip r:embed="rId28" cstate="none"/>
                     <a:srcRect/>
                     <a:stretch>
                       <a:fillRect/>
@@ -34248,98 +34708,15 @@
     </w:p>
     <w:p>
       <w:pPr>
-        <w:spacing w:after="110" w:line="300"/>
-        <w:jc w:val="both"/>
-      </w:pPr>
-      <w:r>
-        <w:rPr>
-          <w:rFonts w:ascii="Times New Roman" w:cs="Times New Roman" w:eastAsia="Times New Roman" w:hAnsi="Times New Roman"/>
-          <w:b/>
-          <w:bCs/>
-          <w:i w:val="false"/>
-          <w:iCs w:val="false"/>
-          <w:color w:val="2E7D32"/>
-          <w:sz w:val="24"/>
-          <w:szCs w:val="24"/>
-        </w:rPr>
-        <w:t xml:space="preserve">Définition — </w:t>
-      </w:r>
-      <w:r>
-        <w:rPr>
-          <w:rFonts w:ascii="Times New Roman" w:cs="Times New Roman" w:eastAsia="Times New Roman" w:hAnsi="Times New Roman"/>
-          <w:b/>
-          <w:bCs/>
-          <w:i w:val="false"/>
-          <w:iCs w:val="false"/>
-          <w:color w:val="000000"/>
-          <w:sz w:val="24"/>
-          <w:szCs w:val="24"/>
-        </w:rPr>
-        <w:t xml:space="preserve">L’événement contraire de A, noté Ā, est l’événement qui se réalise exactement quand A ne se réalise pas. Les probabilités de A et de son contraire se complètent : P(A) + P(Ā) = 1, d’où P(Ā) = 1 − P(A).</w:t>
-      </w:r>
-    </w:p>
-    <w:p>
-      <w:pPr>
-        <w:spacing w:after="110" w:line="300"/>
-        <w:jc w:val="both"/>
-      </w:pPr>
-      <w:r>
-        <w:rPr>
-          <w:rFonts w:ascii="Times New Roman" w:cs="Times New Roman" w:eastAsia="Times New Roman" w:hAnsi="Times New Roman"/>
-          <w:b/>
-          <w:bCs/>
-          <w:i w:val="false"/>
-          <w:iCs w:val="false"/>
-          <w:color w:val="1F4E79"/>
-          <w:sz w:val="24"/>
-          <w:szCs w:val="24"/>
-        </w:rPr>
-        <w:t xml:space="preserve">Autrement dit : </w:t>
-      </w:r>
-      <w:r>
-        <w:rPr>
-          <w:rFonts w:ascii="Times New Roman" w:cs="Times New Roman" w:eastAsia="Times New Roman" w:hAnsi="Times New Roman"/>
-          <w:b w:val="false"/>
-          <w:bCs w:val="false"/>
-          <w:i w:val="false"/>
-          <w:iCs w:val="false"/>
-          <w:color w:val="000000"/>
-          <w:sz w:val="24"/>
-          <w:szCs w:val="24"/>
-        </w:rPr>
-        <w:t xml:space="preserve">A et son contraire se partagent TOUTE la chance : ce que l’un n’a pas, l’autre l’a.</w:t>
-      </w:r>
-    </w:p>
-    <w:p>
-      <w:pPr>
-        <w:spacing w:after="110" w:line="300"/>
-        <w:jc w:val="both"/>
-      </w:pPr>
-      <w:r>
-        <w:rPr>
-          <w:rFonts w:ascii="Times New Roman" w:cs="Times New Roman" w:eastAsia="Times New Roman" w:hAnsi="Times New Roman"/>
-          <w:b w:val="false"/>
-          <w:bCs w:val="false"/>
-          <w:i w:val="false"/>
-          <w:iCs w:val="false"/>
-          <w:color w:val="000000"/>
-          <w:sz w:val="24"/>
-          <w:szCs w:val="24"/>
-        </w:rPr>
-        <w:t xml:space="preserve">Le contraire se définit par la négation exacte : « obtenir 6 » ↔ « ne pas obtenir 6 » ; « au moins un » ↔ « aucun » ; « tous » ↔ « au moins un manque ». Attention aux faux contraires : le contraire de « gagner » n’est pas « perdre » s’il existe le match nul ! La formule P(Ā) = 1 − P(A) devient une stratégie de calcul : quand l’événement direct est compliqué (« au moins un 6 en deux lancers » : beaucoup de cas), son contraire est souvent simple (« aucun 6 » : un seul type de cas). Le détour par le contraire est l’une des plus belles ruses des probabilités.</w:t>
-      </w:r>
-    </w:p>
-    <w:p>
-      <w:pPr>
         <w:spacing w:after="120" w:before="120"/>
         <w:jc w:val="center"/>
       </w:pPr>
       <w:r>
         <w:drawing>
           <wp:inline distT="0" distB="0" distL="0" distR="0">
-            <wp:extent cx="4762500" cy="2333625"/>
+            <wp:extent cx="4095750" cy="2238375"/>
             <wp:effectExtent t="0" r="0" b="0" l="0"/>
-            <wp:docPr id="11" name="" descr="" title=""/>
+            <wp:docPr id="21" name="" descr="" title=""/>
             <wp:cNvGraphicFramePr>
               <a:graphicFrameLocks xmlns:a="http://schemas.openxmlformats.org/drawingml/2006/main" noChangeAspect="1"/>
             </wp:cNvGraphicFramePr>
@@ -34353,7 +34730,136 @@
                     </pic:cNvPicPr>
                   </pic:nvPicPr>
                   <pic:blipFill>
-                    <a:blip r:embed="rId19" cstate="none"/>
+                    <a:blip r:embed="rId29" cstate="none"/>
+                    <a:srcRect/>
+                    <a:stretch>
+                      <a:fillRect/>
+                    </a:stretch>
+                  </pic:blipFill>
+                  <pic:spPr bwMode="auto">
+                    <a:xfrm>
+                      <a:off x="0" y="0"/>
+                      <a:ext cx="4095750" cy="2238375"/>
+                    </a:xfrm>
+                    <a:prstGeom prst="rect">
+                      <a:avLst/>
+                    </a:prstGeom>
+                  </pic:spPr>
+                </pic:pic>
+              </a:graphicData>
+            </a:graphic>
+          </wp:inline>
+        </w:drawing>
+      </w:r>
+    </w:p>
+    <w:p>
+      <w:pPr>
+        <w:spacing w:after="110" w:line="300"/>
+        <w:jc w:val="both"/>
+      </w:pPr>
+      <w:r>
+        <w:rPr>
+          <w:rFonts w:ascii="Times New Roman" w:cs="Times New Roman" w:eastAsia="Times New Roman" w:hAnsi="Times New Roman"/>
+          <w:b/>
+          <w:bCs/>
+          <w:i w:val="false"/>
+          <w:iCs w:val="false"/>
+          <w:color w:val="2E7D32"/>
+          <w:sz w:val="24"/>
+          <w:szCs w:val="24"/>
+        </w:rPr>
+        <w:t xml:space="preserve">Définition — </w:t>
+      </w:r>
+      <w:r>
+        <w:rPr>
+          <w:rFonts w:ascii="Times New Roman" w:cs="Times New Roman" w:eastAsia="Times New Roman" w:hAnsi="Times New Roman"/>
+          <w:b/>
+          <w:bCs/>
+          <w:i w:val="false"/>
+          <w:iCs w:val="false"/>
+          <w:color w:val="000000"/>
+          <w:sz w:val="24"/>
+          <w:szCs w:val="24"/>
+        </w:rPr>
+        <w:t xml:space="preserve">L’événement contraire de A, noté Ā, est l’événement qui se réalise exactement quand A ne se réalise pas. Les probabilités de A et de son contraire se complètent : P(A) + P(Ā) = 1, d’où P(Ā) = 1 − P(A).</w:t>
+      </w:r>
+    </w:p>
+    <w:p>
+      <w:pPr>
+        <w:spacing w:after="110" w:line="300"/>
+        <w:jc w:val="both"/>
+      </w:pPr>
+      <w:r>
+        <w:rPr>
+          <w:rFonts w:ascii="Times New Roman" w:cs="Times New Roman" w:eastAsia="Times New Roman" w:hAnsi="Times New Roman"/>
+          <w:b/>
+          <w:bCs/>
+          <w:i w:val="false"/>
+          <w:iCs w:val="false"/>
+          <w:color w:val="1F4E79"/>
+          <w:sz w:val="24"/>
+          <w:szCs w:val="24"/>
+        </w:rPr>
+        <w:t xml:space="preserve">Autrement dit : </w:t>
+      </w:r>
+      <w:r>
+        <w:rPr>
+          <w:rFonts w:ascii="Times New Roman" w:cs="Times New Roman" w:eastAsia="Times New Roman" w:hAnsi="Times New Roman"/>
+          <w:b w:val="false"/>
+          <w:bCs w:val="false"/>
+          <w:i w:val="false"/>
+          <w:iCs w:val="false"/>
+          <w:color w:val="000000"/>
+          <w:sz w:val="24"/>
+          <w:szCs w:val="24"/>
+        </w:rPr>
+        <w:t xml:space="preserve">A et son contraire se partagent TOUTE la chance : ce que l’un n’a pas, l’autre l’a.</w:t>
+      </w:r>
+    </w:p>
+    <w:p>
+      <w:pPr>
+        <w:spacing w:after="110" w:line="300"/>
+        <w:jc w:val="both"/>
+      </w:pPr>
+      <w:r>
+        <w:rPr>
+          <w:rFonts w:ascii="Times New Roman" w:cs="Times New Roman" w:eastAsia="Times New Roman" w:hAnsi="Times New Roman"/>
+          <w:b w:val="false"/>
+          <w:bCs w:val="false"/>
+          <w:i w:val="false"/>
+          <w:iCs w:val="false"/>
+          <w:color w:val="000000"/>
+          <w:sz w:val="24"/>
+          <w:szCs w:val="24"/>
+        </w:rPr>
+        <w:t xml:space="preserve">Le contraire se définit par la négation exacte : « obtenir 6 » ↔ « ne pas obtenir 6 » ; « au moins un » ↔ « aucun » ; « tous » ↔ « au moins un manque ». Attention aux faux contraires : le contraire de « gagner » n’est pas « perdre » s’il existe le match nul ! La formule P(Ā) = 1 − P(A) devient une stratégie de calcul : quand l’événement direct est compliqué (« au moins un 6 en deux lancers » : beaucoup de cas), son contraire est souvent simple (« aucun 6 » : un seul type de cas). Le détour par le contraire est l’une des plus belles ruses des probabilités.</w:t>
+      </w:r>
+    </w:p>
+    <w:p>
+      <w:pPr>
+        <w:spacing w:after="120" w:before="120"/>
+        <w:jc w:val="center"/>
+      </w:pPr>
+      <w:r>
+        <w:drawing>
+          <wp:inline distT="0" distB="0" distL="0" distR="0">
+            <wp:extent cx="4762500" cy="2333625"/>
+            <wp:effectExtent t="0" r="0" b="0" l="0"/>
+            <wp:docPr id="22" name="" descr="" title=""/>
+            <wp:cNvGraphicFramePr>
+              <a:graphicFrameLocks xmlns:a="http://schemas.openxmlformats.org/drawingml/2006/main" noChangeAspect="1"/>
+            </wp:cNvGraphicFramePr>
+            <a:graphic xmlns:a="http://schemas.openxmlformats.org/drawingml/2006/main">
+              <a:graphicData uri="http://schemas.openxmlformats.org/drawingml/2006/picture">
+                <pic:pic xmlns:pic="http://schemas.openxmlformats.org/drawingml/2006/picture">
+                  <pic:nvPicPr>
+                    <pic:cNvPr id="0" name="" descr=""/>
+                    <pic:cNvPicPr>
+                      <a:picLocks noChangeAspect="1" noChangeArrowheads="1"/>
+                    </pic:cNvPicPr>
+                  </pic:nvPicPr>
+                  <pic:blipFill>
+                    <a:blip r:embed="rId30" cstate="none"/>
                     <a:srcRect/>
                     <a:stretch>
                       <a:fillRect/>

</xml_diff>